<commit_message>
Fixing deep dream plot
</commit_message>
<xml_diff>
--- a/doc/deliverable/Week 6.docx
+++ b/doc/deliverable/Week 6.docx
@@ -99,9 +99,8 @@
           <w:szCs w:val="22"/>
           <w14:ligatures w14:val="none"/>
         </w:rPr>
-        <w:t xml:space="preserve">o interpret the features captured by the different encoding layers of the </w:t>
+        <w:t>o interpret the features captured by the different encoding layers of the nnU</w:t>
       </w:r>
-      <w:proofErr w:type="spellStart"/>
       <w:r>
         <w:rPr>
           <w:rFonts w:ascii="Arial" w:hAnsi="Arial" w:cs="Arial"/>
@@ -110,9 +109,8 @@
           <w:szCs w:val="22"/>
           <w14:ligatures w14:val="none"/>
         </w:rPr>
-        <w:t>nnUNET</w:t>
+        <w:t>Net</w:t>
       </w:r>
-      <w:proofErr w:type="spellEnd"/>
       <w:r>
         <w:rPr>
           <w:rFonts w:ascii="Arial" w:hAnsi="Arial" w:cs="Arial"/>
@@ -131,7 +129,27 @@
           <w:szCs w:val="22"/>
           <w14:ligatures w14:val="none"/>
         </w:rPr>
-        <w:t xml:space="preserve"> The code has been implemented and being tuned.</w:t>
+        <w:t xml:space="preserve"> The code has been implemented and </w:t>
+      </w:r>
+      <w:r>
+        <w:rPr>
+          <w:rFonts w:ascii="Arial" w:hAnsi="Arial" w:cs="Arial"/>
+          <w:kern w:val="0"/>
+          <w:sz w:val="22"/>
+          <w:szCs w:val="22"/>
+          <w14:ligatures w14:val="none"/>
+        </w:rPr>
+        <w:t xml:space="preserve">is </w:t>
+      </w:r>
+      <w:r>
+        <w:rPr>
+          <w:rFonts w:ascii="Arial" w:hAnsi="Arial" w:cs="Arial"/>
+          <w:kern w:val="0"/>
+          <w:sz w:val="22"/>
+          <w:szCs w:val="22"/>
+          <w14:ligatures w14:val="none"/>
+        </w:rPr>
+        <w:t>being tuned.</w:t>
       </w:r>
     </w:p>
     <w:p>

</xml_diff>

<commit_message>
Added Week 6 and 7
</commit_message>
<xml_diff>
--- a/doc/deliverable/Week 6.docx
+++ b/doc/deliverable/Week 6.docx
@@ -89,7 +89,29 @@
           <w:szCs w:val="22"/>
           <w14:ligatures w14:val="none"/>
         </w:rPr>
-        <w:t>We discussed the Deep Dream technique t</w:t>
+        <w:t xml:space="preserve">We discussed the </w:t>
+      </w:r>
+      <w:proofErr w:type="spellStart"/>
+      <w:r>
+        <w:rPr>
+          <w:rFonts w:ascii="Arial" w:hAnsi="Arial" w:cs="Arial"/>
+          <w:kern w:val="0"/>
+          <w:sz w:val="22"/>
+          <w:szCs w:val="22"/>
+          <w14:ligatures w14:val="none"/>
+        </w:rPr>
+        <w:t>DeepDream</w:t>
+      </w:r>
+      <w:proofErr w:type="spellEnd"/>
+      <w:r>
+        <w:rPr>
+          <w:rFonts w:ascii="Arial" w:hAnsi="Arial" w:cs="Arial"/>
+          <w:kern w:val="0"/>
+          <w:sz w:val="22"/>
+          <w:szCs w:val="22"/>
+          <w14:ligatures w14:val="none"/>
+        </w:rPr>
+        <w:t xml:space="preserve"> technique </w:t>
       </w:r>
       <w:r>
         <w:rPr>
@@ -99,7 +121,7 @@
           <w:szCs w:val="22"/>
           <w14:ligatures w14:val="none"/>
         </w:rPr>
-        <w:t>o interpret the features captured by the different encoding layers of the nnU</w:t>
+        <w:t>for</w:t>
       </w:r>
       <w:r>
         <w:rPr>
@@ -109,8 +131,50 @@
           <w:szCs w:val="22"/>
           <w14:ligatures w14:val="none"/>
         </w:rPr>
+        <w:t xml:space="preserve"> interpret</w:t>
+      </w:r>
+      <w:r>
+        <w:rPr>
+          <w:rFonts w:ascii="Arial" w:hAnsi="Arial" w:cs="Arial"/>
+          <w:kern w:val="0"/>
+          <w:sz w:val="22"/>
+          <w:szCs w:val="22"/>
+          <w14:ligatures w14:val="none"/>
+        </w:rPr>
+        <w:t>ing</w:t>
+      </w:r>
+      <w:r>
+        <w:rPr>
+          <w:rFonts w:ascii="Arial" w:hAnsi="Arial" w:cs="Arial"/>
+          <w:kern w:val="0"/>
+          <w:sz w:val="22"/>
+          <w:szCs w:val="22"/>
+          <w14:ligatures w14:val="none"/>
+        </w:rPr>
+        <w:t xml:space="preserve"> the features captured by the different encoding layers of the </w:t>
+      </w:r>
+      <w:proofErr w:type="spellStart"/>
+      <w:r>
+        <w:rPr>
+          <w:rFonts w:ascii="Arial" w:hAnsi="Arial" w:cs="Arial"/>
+          <w:kern w:val="0"/>
+          <w:sz w:val="22"/>
+          <w:szCs w:val="22"/>
+          <w14:ligatures w14:val="none"/>
+        </w:rPr>
+        <w:t>nnU</w:t>
+      </w:r>
+      <w:r>
+        <w:rPr>
+          <w:rFonts w:ascii="Arial" w:hAnsi="Arial" w:cs="Arial"/>
+          <w:kern w:val="0"/>
+          <w:sz w:val="22"/>
+          <w:szCs w:val="22"/>
+          <w14:ligatures w14:val="none"/>
+        </w:rPr>
         <w:t>Net</w:t>
       </w:r>
+      <w:proofErr w:type="spellEnd"/>
       <w:r>
         <w:rPr>
           <w:rFonts w:ascii="Arial" w:hAnsi="Arial" w:cs="Arial"/>
@@ -119,7 +183,7 @@
           <w:szCs w:val="22"/>
           <w14:ligatures w14:val="none"/>
         </w:rPr>
-        <w:t xml:space="preserve"> model for segmenting the GBM tumor regions.</w:t>
+        <w:t xml:space="preserve"> model for segmenting GBM tumor regions.</w:t>
       </w:r>
       <w:r>
         <w:rPr>
@@ -157,18 +221,6 @@
         <w:spacing w:before="120" w:after="0" w:line="240" w:lineRule="auto"/>
         <w:rPr>
           <w:rFonts w:ascii="Arial" w:hAnsi="Arial" w:cs="Arial"/>
-          <w:kern w:val="0"/>
-          <w:sz w:val="22"/>
-          <w:szCs w:val="22"/>
-          <w14:ligatures w14:val="none"/>
-        </w:rPr>
-      </w:pPr>
-    </w:p>
-    <w:p>
-      <w:pPr>
-        <w:spacing w:before="120" w:after="0" w:line="240" w:lineRule="auto"/>
-        <w:rPr>
-          <w:rFonts w:ascii="Arial" w:hAnsi="Arial" w:cs="Arial"/>
           <w:sz w:val="22"/>
           <w:szCs w:val="22"/>
         </w:rPr>
@@ -181,10 +233,10 @@
           <w:szCs w:val="22"/>
         </w:rPr>
         <w:drawing>
-          <wp:inline distT="0" distB="0" distL="0" distR="0" wp14:anchorId="75D5AF81" wp14:editId="46E85589">
-            <wp:extent cx="5943600" cy="5238750"/>
-            <wp:effectExtent l="0" t="0" r="0" b="6350"/>
-            <wp:docPr id="1301481996" name="Picture 1" descr="A close-up of a brain scan&#10;&#10;AI-generated content may be incorrect."/>
+          <wp:inline distT="0" distB="0" distL="0" distR="0" wp14:anchorId="3AD0B53D" wp14:editId="4484C7B2">
+            <wp:extent cx="5943600" cy="5252720"/>
+            <wp:effectExtent l="0" t="0" r="0" b="5080"/>
+            <wp:docPr id="192109295" name="Picture 1" descr="A collage of images of a brain&#10;&#10;AI-generated content may be incorrect."/>
             <wp:cNvGraphicFramePr>
               <a:graphicFrameLocks xmlns:a="http://schemas.openxmlformats.org/drawingml/2006/main" noChangeAspect="1"/>
             </wp:cNvGraphicFramePr>
@@ -192,7 +244,7 @@
               <a:graphicData uri="http://schemas.openxmlformats.org/drawingml/2006/picture">
                 <pic:pic xmlns:pic="http://schemas.openxmlformats.org/drawingml/2006/picture">
                   <pic:nvPicPr>
-                    <pic:cNvPr id="1301481996" name="Picture 1" descr="A close-up of a brain scan&#10;&#10;AI-generated content may be incorrect."/>
+                    <pic:cNvPr id="192109295" name="Picture 1" descr="A collage of images of a brain&#10;&#10;AI-generated content may be incorrect."/>
                     <pic:cNvPicPr/>
                   </pic:nvPicPr>
                   <pic:blipFill>
@@ -210,7 +262,7 @@
                   <pic:spPr>
                     <a:xfrm>
                       <a:off x="0" y="0"/>
-                      <a:ext cx="5943600" cy="5238750"/>
+                      <a:ext cx="5943600" cy="5252720"/>
                     </a:xfrm>
                     <a:prstGeom prst="rect">
                       <a:avLst/>
@@ -263,8 +315,11 @@
       <w:r>
         <w:rPr>
           <w:rFonts w:ascii="Arial" w:hAnsi="Arial" w:cs="Arial"/>
-          <w:sz w:val="22"/>
-          <w:szCs w:val="22"/>
+          <w:b/>
+          <w:bCs/>
+          <w:sz w:val="22"/>
+          <w:szCs w:val="22"/>
+          <w:u w:val="single"/>
         </w:rPr>
         <w:t>Algorithm</w:t>
       </w:r>
@@ -282,7 +337,7 @@
         <w:pStyle w:val="ListParagraph"/>
         <w:numPr>
           <w:ilvl w:val="0"/>
-          <w:numId w:val="14"/>
+          <w:numId w:val="15"/>
         </w:numPr>
         <w:spacing w:after="0"/>
         <w:rPr>
@@ -305,7 +360,7 @@
         <w:pStyle w:val="ListParagraph"/>
         <w:numPr>
           <w:ilvl w:val="0"/>
-          <w:numId w:val="14"/>
+          <w:numId w:val="15"/>
         </w:numPr>
         <w:spacing w:after="0"/>
         <w:rPr>
@@ -344,7 +399,7 @@
         <w:pStyle w:val="ListParagraph"/>
         <w:numPr>
           <w:ilvl w:val="0"/>
-          <w:numId w:val="14"/>
+          <w:numId w:val="15"/>
         </w:numPr>
         <w:spacing w:after="0"/>
         <w:rPr>
@@ -399,7 +454,7 @@
         <w:pStyle w:val="ListParagraph"/>
         <w:numPr>
           <w:ilvl w:val="0"/>
-          <w:numId w:val="14"/>
+          <w:numId w:val="15"/>
         </w:numPr>
         <w:spacing w:after="0"/>
         <w:rPr>
@@ -416,7 +471,6 @@
           <w:szCs w:val="22"/>
           <w14:ligatures w14:val="none"/>
         </w:rPr>
-        <w:lastRenderedPageBreak/>
         <w:t>For each scale, starting with the smallest (i.e., current one): - Run gradient ascent - Upscale the image to the next scale - Reinject the detail that was lost during upscaling.</w:t>
       </w:r>
     </w:p>
@@ -425,7 +479,7 @@
         <w:pStyle w:val="ListParagraph"/>
         <w:numPr>
           <w:ilvl w:val="0"/>
-          <w:numId w:val="14"/>
+          <w:numId w:val="15"/>
         </w:numPr>
         <w:spacing w:after="0"/>
         <w:rPr>
@@ -442,6 +496,7 @@
           <w:szCs w:val="22"/>
           <w14:ligatures w14:val="none"/>
         </w:rPr>
+        <w:lastRenderedPageBreak/>
         <w:t>Stop when we return to the original size. To recover the detail lost during upscaling, simply take the original image, reduce its size, upscale it again, and compare the result to the (resized) original image.</w:t>
       </w:r>
     </w:p>
@@ -1963,6 +2018,119 @@
     </w:lvl>
   </w:abstractNum>
   <w:abstractNum w:abstractNumId="12" w15:restartNumberingAfterBreak="0">
+    <w:nsid w:val="614B42FA"/>
+    <w:multiLevelType w:val="hybridMultilevel"/>
+    <w:tmpl w:val="6B308028"/>
+    <w:lvl w:ilvl="0" w:tplc="0409000F">
+      <w:start w:val="1"/>
+      <w:numFmt w:val="decimal"/>
+      <w:lvlText w:val="%1."/>
+      <w:lvlJc w:val="left"/>
+      <w:pPr>
+        <w:ind w:left="360" w:hanging="360"/>
+      </w:pPr>
+      <w:rPr>
+        <w:rFonts w:hint="default"/>
+      </w:rPr>
+    </w:lvl>
+    <w:lvl w:ilvl="1" w:tplc="FFFFFFFF" w:tentative="1">
+      <w:start w:val="1"/>
+      <w:numFmt w:val="bullet"/>
+      <w:lvlText w:val="o"/>
+      <w:lvlJc w:val="left"/>
+      <w:pPr>
+        <w:ind w:left="1080" w:hanging="360"/>
+      </w:pPr>
+      <w:rPr>
+        <w:rFonts w:ascii="Courier New" w:hAnsi="Courier New" w:cs="Courier New" w:hint="default"/>
+      </w:rPr>
+    </w:lvl>
+    <w:lvl w:ilvl="2" w:tplc="FFFFFFFF" w:tentative="1">
+      <w:start w:val="1"/>
+      <w:numFmt w:val="bullet"/>
+      <w:lvlText w:val=""/>
+      <w:lvlJc w:val="left"/>
+      <w:pPr>
+        <w:ind w:left="1800" w:hanging="360"/>
+      </w:pPr>
+      <w:rPr>
+        <w:rFonts w:ascii="Wingdings" w:hAnsi="Wingdings" w:hint="default"/>
+      </w:rPr>
+    </w:lvl>
+    <w:lvl w:ilvl="3" w:tplc="FFFFFFFF" w:tentative="1">
+      <w:start w:val="1"/>
+      <w:numFmt w:val="bullet"/>
+      <w:lvlText w:val=""/>
+      <w:lvlJc w:val="left"/>
+      <w:pPr>
+        <w:ind w:left="2520" w:hanging="360"/>
+      </w:pPr>
+      <w:rPr>
+        <w:rFonts w:ascii="Symbol" w:hAnsi="Symbol" w:hint="default"/>
+      </w:rPr>
+    </w:lvl>
+    <w:lvl w:ilvl="4" w:tplc="FFFFFFFF" w:tentative="1">
+      <w:start w:val="1"/>
+      <w:numFmt w:val="bullet"/>
+      <w:lvlText w:val="o"/>
+      <w:lvlJc w:val="left"/>
+      <w:pPr>
+        <w:ind w:left="3240" w:hanging="360"/>
+      </w:pPr>
+      <w:rPr>
+        <w:rFonts w:ascii="Courier New" w:hAnsi="Courier New" w:cs="Courier New" w:hint="default"/>
+      </w:rPr>
+    </w:lvl>
+    <w:lvl w:ilvl="5" w:tplc="FFFFFFFF" w:tentative="1">
+      <w:start w:val="1"/>
+      <w:numFmt w:val="bullet"/>
+      <w:lvlText w:val=""/>
+      <w:lvlJc w:val="left"/>
+      <w:pPr>
+        <w:ind w:left="3960" w:hanging="360"/>
+      </w:pPr>
+      <w:rPr>
+        <w:rFonts w:ascii="Wingdings" w:hAnsi="Wingdings" w:hint="default"/>
+      </w:rPr>
+    </w:lvl>
+    <w:lvl w:ilvl="6" w:tplc="FFFFFFFF" w:tentative="1">
+      <w:start w:val="1"/>
+      <w:numFmt w:val="bullet"/>
+      <w:lvlText w:val=""/>
+      <w:lvlJc w:val="left"/>
+      <w:pPr>
+        <w:ind w:left="4680" w:hanging="360"/>
+      </w:pPr>
+      <w:rPr>
+        <w:rFonts w:ascii="Symbol" w:hAnsi="Symbol" w:hint="default"/>
+      </w:rPr>
+    </w:lvl>
+    <w:lvl w:ilvl="7" w:tplc="FFFFFFFF" w:tentative="1">
+      <w:start w:val="1"/>
+      <w:numFmt w:val="bullet"/>
+      <w:lvlText w:val="o"/>
+      <w:lvlJc w:val="left"/>
+      <w:pPr>
+        <w:ind w:left="5400" w:hanging="360"/>
+      </w:pPr>
+      <w:rPr>
+        <w:rFonts w:ascii="Courier New" w:hAnsi="Courier New" w:cs="Courier New" w:hint="default"/>
+      </w:rPr>
+    </w:lvl>
+    <w:lvl w:ilvl="8" w:tplc="FFFFFFFF" w:tentative="1">
+      <w:start w:val="1"/>
+      <w:numFmt w:val="bullet"/>
+      <w:lvlText w:val=""/>
+      <w:lvlJc w:val="left"/>
+      <w:pPr>
+        <w:ind w:left="6120" w:hanging="360"/>
+      </w:pPr>
+      <w:rPr>
+        <w:rFonts w:ascii="Wingdings" w:hAnsi="Wingdings" w:hint="default"/>
+      </w:rPr>
+    </w:lvl>
+  </w:abstractNum>
+  <w:abstractNum w:abstractNumId="13" w15:restartNumberingAfterBreak="0">
     <w:nsid w:val="64BB3715"/>
     <w:multiLevelType w:val="hybridMultilevel"/>
     <w:tmpl w:val="D5C43D10"/>
@@ -2075,7 +2243,7 @@
       </w:rPr>
     </w:lvl>
   </w:abstractNum>
-  <w:abstractNum w:abstractNumId="13" w15:restartNumberingAfterBreak="0">
+  <w:abstractNum w:abstractNumId="14" w15:restartNumberingAfterBreak="0">
     <w:nsid w:val="691346C2"/>
     <w:multiLevelType w:val="multilevel"/>
     <w:tmpl w:val="9EB612EE"/>
@@ -2192,7 +2360,7 @@
     <w:abstractNumId w:val="5"/>
   </w:num>
   <w:num w:numId="2" w16cid:durableId="1539665779">
-    <w:abstractNumId w:val="12"/>
+    <w:abstractNumId w:val="13"/>
   </w:num>
   <w:num w:numId="3" w16cid:durableId="1683238930">
     <w:abstractNumId w:val="11"/>
@@ -2210,7 +2378,7 @@
     <w:abstractNumId w:val="4"/>
   </w:num>
   <w:num w:numId="8" w16cid:durableId="1222867050">
-    <w:abstractNumId w:val="13"/>
+    <w:abstractNumId w:val="14"/>
   </w:num>
   <w:num w:numId="9" w16cid:durableId="1458910897">
     <w:abstractNumId w:val="8"/>
@@ -2229,6 +2397,9 @@
   </w:num>
   <w:num w:numId="14" w16cid:durableId="256789609">
     <w:abstractNumId w:val="2"/>
+  </w:num>
+  <w:num w:numId="15" w16cid:durableId="1175151133">
+    <w:abstractNumId w:val="12"/>
   </w:num>
 </w:numbering>
 </file>

</xml_diff>